<commit_message>
docs: align practical 3 report with assignment
</commit_message>
<xml_diff>
--- a/reports/3 практичка девопс.docx
+++ b/reports/3 практичка девопс.docx
@@ -1711,7 +1711,7 @@
           <w:color w:val="000000"/>
           <w:sz w:val="23"/>
         </w:rPr>
-        <w:t>После отправки выполнена проверка через GitHub API. Оба репозитория содержали один и тот же последний коммит, что подтверждает успешную синхронизацию.</w:t>
+        <w:t>После отправки оба репозитория открыты в браузере. В основном репозитории и зеркале присутствует один и тот же коммит bd518b5 с сообщением chore: test multi-remote push, что подтверждает успешную синхронизацию.</w:t>
       </w:r>
     </w:p>
     <w:p>
@@ -1723,7 +1723,7 @@
       <w:r>
         <w:drawing>
           <wp:inline xmlns:a="http://schemas.openxmlformats.org/drawingml/2006/main" xmlns:pic="http://schemas.openxmlformats.org/drawingml/2006/picture">
-            <wp:extent cx="5760720" cy="1382573"/>
+            <wp:extent cx="5257800" cy="2184009"/>
             <wp:docPr id="9" name="Picture 9"/>
             <wp:cNvGraphicFramePr>
               <a:graphicFrameLocks noChangeAspect="1"/>
@@ -1732,7 +1732,7 @@
               <a:graphicData uri="http://schemas.openxmlformats.org/drawingml/2006/picture">
                 <pic:pic>
                   <pic:nvPicPr>
-                    <pic:cNvPr id="0" name="09-both-repositories.png"/>
+                    <pic:cNvPr id="0" name="09a-main-repository-browser.png"/>
                     <pic:cNvPicPr/>
                   </pic:nvPicPr>
                   <pic:blipFill>
@@ -1744,7 +1744,7 @@
                   <pic:spPr>
                     <a:xfrm>
                       <a:off x="0" y="0"/>
-                      <a:ext cx="5760720" cy="1382573"/>
+                      <a:ext cx="5257800" cy="2184009"/>
                     </a:xfrm>
                     <a:prstGeom prst="rect"/>
                   </pic:spPr>
@@ -1768,7 +1768,64 @@
           <w:color w:val="000000"/>
           <w:sz w:val="19"/>
         </w:rPr>
-        <w:t>Рисунок 9 — Проверка последнего коммита в двух репозиториях</w:t>
+        <w:t>Рисунок 9 — Тестовый коммит в основном репозитории GitHub</w:t>
+      </w:r>
+    </w:p>
+    <w:p>
+      <w:pPr>
+        <w:keepNext/>
+        <w:spacing w:before="40" w:after="40"/>
+        <w:jc w:val="center"/>
+      </w:pPr>
+      <w:r>
+        <w:drawing>
+          <wp:inline xmlns:a="http://schemas.openxmlformats.org/drawingml/2006/main" xmlns:pic="http://schemas.openxmlformats.org/drawingml/2006/picture">
+            <wp:extent cx="5257800" cy="2184009"/>
+            <wp:docPr id="10" name="Picture 10"/>
+            <wp:cNvGraphicFramePr>
+              <a:graphicFrameLocks noChangeAspect="1"/>
+            </wp:cNvGraphicFramePr>
+            <a:graphic>
+              <a:graphicData uri="http://schemas.openxmlformats.org/drawingml/2006/picture">
+                <pic:pic>
+                  <pic:nvPicPr>
+                    <pic:cNvPr id="0" name="09b-mirror-repository-browser.png"/>
+                    <pic:cNvPicPr/>
+                  </pic:nvPicPr>
+                  <pic:blipFill>
+                    <a:blip r:embed="rId19"/>
+                    <a:stretch>
+                      <a:fillRect/>
+                    </a:stretch>
+                  </pic:blipFill>
+                  <pic:spPr>
+                    <a:xfrm>
+                      <a:off x="0" y="0"/>
+                      <a:ext cx="5257800" cy="2184009"/>
+                    </a:xfrm>
+                    <a:prstGeom prst="rect"/>
+                  </pic:spPr>
+                </pic:pic>
+              </a:graphicData>
+            </a:graphic>
+          </wp:inline>
+        </w:drawing>
+      </w:r>
+    </w:p>
+    <w:p>
+      <w:pPr>
+        <w:spacing w:before="0" w:after="100"/>
+        <w:jc w:val="center"/>
+      </w:pPr>
+      <w:r>
+        <w:rPr>
+          <w:rFonts w:ascii="Times New Roman" w:hAnsi="Times New Roman" w:eastAsia="Times New Roman"/>
+          <w:b w:val="0"/>
+          <w:i/>
+          <w:color w:val="000000"/>
+          <w:sz w:val="19"/>
+        </w:rPr>
+        <w:t>Рисунок 10 — Тестовый коммит в зеркальном репозитории GitHub</w:t>
       </w:r>
     </w:p>
     <w:p>
@@ -1785,7 +1842,7 @@
         </w:rPr>
         <w:t xml:space="preserve">Основной репозиторий: </w:t>
       </w:r>
-      <w:hyperlink r:id="rId19">
+      <w:hyperlink r:id="rId20">
         <w:r>
           <w:rPr>
             <w:rFonts w:ascii="Menlo" w:hAnsi="Menlo"/>
@@ -1811,7 +1868,7 @@
         </w:rPr>
         <w:t xml:space="preserve">Зеркальный репозиторий: </w:t>
       </w:r>
-      <w:hyperlink r:id="rId20">
+      <w:hyperlink r:id="rId21">
         <w:r>
           <w:rPr>
             <w:rFonts w:ascii="Menlo" w:hAnsi="Menlo"/>
@@ -1822,11 +1879,6 @@
           <w:t>github.com/blur3773/devops-course-2026-mirror</w:t>
         </w:r>
       </w:hyperlink>
-    </w:p>
-    <w:p>
-      <w:r>
-        <w:br w:type="page"/>
-      </w:r>
     </w:p>
     <w:p>
       <w:pPr>
@@ -1888,7 +1940,7 @@
         <w:drawing>
           <wp:inline xmlns:a="http://schemas.openxmlformats.org/drawingml/2006/main" xmlns:pic="http://schemas.openxmlformats.org/drawingml/2006/picture">
             <wp:extent cx="5669280" cy="2324405"/>
-            <wp:docPr id="10" name="Picture 10"/>
+            <wp:docPr id="11" name="Picture 11"/>
             <wp:cNvGraphicFramePr>
               <a:graphicFrameLocks noChangeAspect="1"/>
             </wp:cNvGraphicFramePr>
@@ -1900,7 +1952,7 @@
                     <pic:cNvPicPr/>
                   </pic:nvPicPr>
                   <pic:blipFill>
-                    <a:blip r:embed="rId21"/>
+                    <a:blip r:embed="rId22"/>
                     <a:stretch>
                       <a:fillRect/>
                     </a:stretch>
@@ -1932,7 +1984,7 @@
           <w:color w:val="000000"/>
           <w:sz w:val="19"/>
         </w:rPr>
-        <w:t>Рисунок 10 — Перенос исправления командой cherry-pick</w:t>
+        <w:t>Рисунок 11 — Перенос исправления командой cherry-pick</w:t>
       </w:r>
     </w:p>
     <w:p>
@@ -1966,7 +2018,7 @@
           <w:color w:val="000000"/>
           <w:sz w:val="23"/>
         </w:rPr>
-        <w:t>После принудительного возврата ветки коммит исчез из обычного журнала, но остался в reflog. По найденному идентификатору была создана ветка recovered-work, а файл recovered_notes.md снова стал доступен.</w:t>
+        <w:t>После удаления временной ветки коммит исчез из обычного журнала, но остался в reflog. По найденному идентификатору была создана ветка temp/recovered-branch, а файл important_data.md снова стал доступен.</w:t>
       </w:r>
     </w:p>
     <w:p>
@@ -1978,8 +2030,8 @@
       <w:r>
         <w:drawing>
           <wp:inline xmlns:a="http://schemas.openxmlformats.org/drawingml/2006/main" xmlns:pic="http://schemas.openxmlformats.org/drawingml/2006/picture">
-            <wp:extent cx="5669280" cy="2110232"/>
-            <wp:docPr id="11" name="Picture 11"/>
+            <wp:extent cx="5669280" cy="1480312"/>
+            <wp:docPr id="12" name="Picture 12"/>
             <wp:cNvGraphicFramePr>
               <a:graphicFrameLocks noChangeAspect="1"/>
             </wp:cNvGraphicFramePr>
@@ -1991,7 +2043,7 @@
                     <pic:cNvPicPr/>
                   </pic:nvPicPr>
                   <pic:blipFill>
-                    <a:blip r:embed="rId22"/>
+                    <a:blip r:embed="rId23"/>
                     <a:stretch>
                       <a:fillRect/>
                     </a:stretch>
@@ -1999,7 +2051,7 @@
                   <pic:spPr>
                     <a:xfrm>
                       <a:off x="0" y="0"/>
-                      <a:ext cx="5669280" cy="2110232"/>
+                      <a:ext cx="5669280" cy="1480312"/>
                     </a:xfrm>
                     <a:prstGeom prst="rect"/>
                   </pic:spPr>
@@ -2023,7 +2075,7 @@
           <w:color w:val="000000"/>
           <w:sz w:val="19"/>
         </w:rPr>
-        <w:t>Рисунок 11 — Поиск потерянного коммита в reflog</w:t>
+        <w:t>Рисунок 12 — Поиск потерянного коммита в reflog</w:t>
       </w:r>
     </w:p>
     <w:p>
@@ -2057,7 +2109,7 @@
         <w:drawing>
           <wp:inline xmlns:a="http://schemas.openxmlformats.org/drawingml/2006/main" xmlns:pic="http://schemas.openxmlformats.org/drawingml/2006/picture">
             <wp:extent cx="5669280" cy="1039368"/>
-            <wp:docPr id="12" name="Picture 12"/>
+            <wp:docPr id="13" name="Picture 13"/>
             <wp:cNvGraphicFramePr>
               <a:graphicFrameLocks noChangeAspect="1"/>
             </wp:cNvGraphicFramePr>
@@ -2069,7 +2121,7 @@
                     <pic:cNvPicPr/>
                   </pic:nvPicPr>
                   <pic:blipFill>
-                    <a:blip r:embed="rId23"/>
+                    <a:blip r:embed="rId24"/>
                     <a:stretch>
                       <a:fillRect/>
                     </a:stretch>
@@ -2101,7 +2153,7 @@
           <w:color w:val="000000"/>
           <w:sz w:val="19"/>
         </w:rPr>
-        <w:t>Рисунок 12 — Восстановленный файл и ветка recovered-work</w:t>
+        <w:t>Рисунок 13 — Восстановленный файл important_data.md</w:t>
       </w:r>
     </w:p>
     <w:p>
@@ -2148,7 +2200,7 @@
         <w:drawing>
           <wp:inline xmlns:a="http://schemas.openxmlformats.org/drawingml/2006/main" xmlns:pic="http://schemas.openxmlformats.org/drawingml/2006/picture">
             <wp:extent cx="5669280" cy="2324405"/>
-            <wp:docPr id="13" name="Picture 13"/>
+            <wp:docPr id="14" name="Picture 14"/>
             <wp:cNvGraphicFramePr>
               <a:graphicFrameLocks noChangeAspect="1"/>
             </wp:cNvGraphicFramePr>
@@ -2160,7 +2212,7 @@
                     <pic:cNvPicPr/>
                   </pic:nvPicPr>
                   <pic:blipFill>
-                    <a:blip r:embed="rId24"/>
+                    <a:blip r:embed="rId25"/>
                     <a:stretch>
                       <a:fillRect/>
                     </a:stretch>
@@ -2192,7 +2244,7 @@
           <w:color w:val="000000"/>
           <w:sz w:val="19"/>
         </w:rPr>
-        <w:t>Рисунок 13 — Отмена ошибочного коммита командой revert</w:t>
+        <w:t>Рисунок 14 — Отмена ошибочного коммита командой revert</w:t>
       </w:r>
     </w:p>
     <w:p>

</xml_diff>

<commit_message>
docs: use GitLab mirror in practical 3
</commit_message>
<xml_diff>
--- a/reports/3 практичка девопс.docx
+++ b/reports/3 практичка девопс.docx
@@ -12,7 +12,6 @@
       </w:pPr>
       <w:r>
         <w:rPr>
-          <w:rFonts w:ascii="Times New Roman" w:eastAsia="Times New Roman" w:hAnsi="Times New Roman"/>
           <w:sz w:val="24"/>
           <w:lang w:val="ru-RU"/>
         </w:rPr>
@@ -29,7 +28,6 @@
       </w:pPr>
       <w:r>
         <w:rPr>
-          <w:rFonts w:ascii="Times New Roman" w:eastAsia="Times New Roman" w:hAnsi="Times New Roman"/>
           <w:lang w:val="ru-RU"/>
         </w:rPr>
         <w:t>Федеральное государственное бюджетное образовательное учреждение</w:t>
@@ -45,7 +43,6 @@
       </w:pPr>
       <w:r>
         <w:rPr>
-          <w:rFonts w:ascii="Times New Roman" w:eastAsia="Times New Roman" w:hAnsi="Times New Roman"/>
           <w:lang w:val="ru-RU"/>
         </w:rPr>
         <w:t>высшего образования</w:t>
@@ -61,7 +58,6 @@
       </w:pPr>
       <w:r>
         <w:rPr>
-          <w:rFonts w:ascii="Times New Roman" w:eastAsia="Times New Roman" w:hAnsi="Times New Roman"/>
           <w:b/>
           <w:sz w:val="24"/>
           <w:lang w:val="ru-RU"/>
@@ -79,12 +75,11 @@
       </w:pPr>
       <w:r>
         <w:rPr>
-          <w:rFonts w:ascii="Times New Roman" w:eastAsia="Times New Roman" w:hAnsi="Times New Roman"/>
           <w:b/>
           <w:sz w:val="36"/>
           <w:lang w:val="ru-RU"/>
         </w:rPr>
-        <w:t xml:space="preserve">ОТЧЕТ</w:t>
+        <w:t>ОТЧЕТ</w:t>
       </w:r>
     </w:p>
     <w:p>
@@ -97,11 +92,10 @@
       </w:pPr>
       <w:r>
         <w:rPr>
-          <w:rFonts w:ascii="Times New Roman" w:eastAsia="Times New Roman" w:hAnsi="Times New Roman"/>
           <w:sz w:val="28"/>
           <w:lang w:val="ru-RU"/>
         </w:rPr>
-        <w:t xml:space="preserve">по практической работе № 3</w:t>
+        <w:t>по практической работе № 3</w:t>
       </w:r>
     </w:p>
     <w:p>
@@ -114,11 +108,10 @@
       </w:pPr>
       <w:r>
         <w:rPr>
-          <w:rFonts w:ascii="Times New Roman" w:eastAsia="Times New Roman" w:hAnsi="Times New Roman"/>
           <w:sz w:val="28"/>
           <w:lang w:val="ru-RU"/>
         </w:rPr>
-        <w:t xml:space="preserve">Практическая работа № 3</w:t>
+        <w:t>Практическая работа № 3</w:t>
       </w:r>
     </w:p>
     <w:p>
@@ -131,18 +124,10 @@
       </w:pPr>
       <w:r>
         <w:rPr>
-          <w:rFonts w:ascii="Times New Roman" w:eastAsia="Times New Roman" w:hAnsi="Times New Roman"/>
           <w:sz w:val="28"/>
           <w:lang w:val="ru-RU"/>
         </w:rPr>
-        <w:t xml:space="preserve">по дисциплине Инструменты DevOps</w:t>
-      </w:r>
-      <w:r>
-        <w:rPr>
-          <w:rFonts w:ascii="Times New Roman" w:eastAsia="Times New Roman" w:hAnsi="Times New Roman"/>
-          <w:sz w:val="28"/>
-        </w:rPr>
-        <w:t/>
+        <w:t>по дисциплине Инструменты DevOps</w:t>
       </w:r>
     </w:p>
     <w:p>
@@ -154,58 +139,31 @@
       </w:pPr>
       <w:r>
         <w:rPr>
-          <w:rFonts w:ascii="Times New Roman" w:eastAsia="Times New Roman" w:hAnsi="Times New Roman"/>
           <w:sz w:val="28"/>
           <w:lang w:val="ru-RU"/>
         </w:rPr>
-        <w:t xml:space="preserve">Тема: Продвинутые техники Git Rebase Squash конфликты и Multi Remote</w:t>
-      </w:r>
-      <w:r>
-        <w:rPr>
-          <w:rFonts w:ascii="Times New Roman" w:eastAsia="Times New Roman" w:hAnsi="Times New Roman"/>
-          <w:sz w:val="28"/>
-        </w:rPr>
-        <w:t/>
-      </w:r>
-      <w:r>
-        <w:rPr>
-          <w:rFonts w:ascii="Times New Roman" w:eastAsia="Times New Roman" w:hAnsi="Times New Roman"/>
-          <w:sz w:val="28"/>
-          <w:lang w:val="ru-RU"/>
-        </w:rPr>
-        <w:t xml:space="preserve"/>
-      </w:r>
-      <w:proofErr w:type="spellStart"/>
-      <w:r>
-        <w:rPr>
-          <w:rFonts w:ascii="Times New Roman" w:eastAsia="Times New Roman" w:hAnsi="Times New Roman"/>
-          <w:sz w:val="28"/>
-        </w:rPr>
-        <w:t/>
-      </w:r>
-      <w:proofErr w:type="spellEnd"/>
+        <w:t>Тема: Продвинутые техники Git Rebase Squash конфликты и Multi Remote</w:t>
+      </w:r>
     </w:p>
     <w:p>
       <w:pPr>
-        <w:spacing w:after="360"/>
-        <w:rPr>
-          <w:lang w:val="ru-RU"/>
-        </w:rPr>
         <w:tabs>
           <w:tab w:val="right" w:pos="9000"/>
         </w:tabs>
-      </w:pPr>
-      <w:r>
-        <w:rPr>
-          <w:rFonts w:ascii="Times New Roman" w:eastAsia="Times New Roman" w:hAnsi="Times New Roman"/>
+        <w:spacing w:after="360"/>
+        <w:rPr>
+          <w:lang w:val="ru-RU"/>
+        </w:rPr>
+      </w:pPr>
+      <w:r>
+        <w:rPr>
           <w:sz w:val="24"/>
           <w:lang w:val="ru-RU"/>
         </w:rPr>
-        <w:t xml:space="preserve">Выполнил: студент группы ЭФБО-11-24</w:t>
-      </w:r>
-      <w:r>
-        <w:rPr>
-          <w:rFonts w:ascii="Times New Roman" w:eastAsia="Times New Roman" w:hAnsi="Times New Roman"/>
+        <w:t>Выполнил: студент группы ЭФБО-11-24</w:t>
+      </w:r>
+      <w:r>
+        <w:rPr>
           <w:sz w:val="24"/>
           <w:lang w:val="ru-RU"/>
         </w:rPr>
@@ -222,11 +180,10 @@
       </w:pPr>
       <w:r>
         <w:rPr>
-          <w:rFonts w:ascii="Times New Roman" w:eastAsia="Times New Roman" w:hAnsi="Times New Roman"/>
           <w:sz w:val="24"/>
           <w:lang w:val="ru-RU"/>
         </w:rPr>
-        <w:t xml:space="preserve">Принял: ____________________</w:t>
+        <w:t>Принял: ____________________</w:t>
       </w:r>
     </w:p>
     <w:p>
@@ -239,17 +196,18 @@
       </w:pPr>
       <w:r>
         <w:rPr>
-          <w:rFonts w:ascii="Times New Roman" w:eastAsia="Times New Roman" w:hAnsi="Times New Roman"/>
           <w:sz w:val="26"/>
           <w:lang w:val="ru-RU"/>
         </w:rPr>
-        <w:t xml:space="preserve">Москва 2026</w:t>
+        <w:t>Москва 2026</w:t>
       </w:r>
     </w:p>
     <w:p>
       <w:pPr>
+        <w:rPr>
+          <w:lang w:val="ru-RU"/>
+        </w:rPr>
         <w:sectPr>
-          <w:type w:val="nextPage"/>
           <w:pgSz w:w="11906" w:h="16838"/>
           <w:pgMar w:top="1134" w:right="850" w:bottom="1134" w:left="1701" w:header="720" w:footer="720" w:gutter="0"/>
           <w:cols w:space="720"/>
@@ -261,34 +219,20 @@
       <w:pPr>
         <w:keepNext/>
         <w:spacing w:before="100" w:after="100"/>
+        <w:rPr>
+          <w:lang w:val="ru-RU"/>
+        </w:rPr>
       </w:pPr>
       <w:r>
         <w:rPr>
           <w:b/>
           <w:color w:val="000000"/>
           <w:sz w:val="32"/>
+          <w:lang w:val="ru-RU"/>
         </w:rPr>
         <w:lastRenderedPageBreak/>
-        <w:t>1.</w:t>
-      </w:r>
-      <w:r>
-        <w:rPr>
-          <w:b/>
-          <w:color w:val="000000"/>
-          <w:sz w:val="32"/>
-        </w:rPr>
-        <w:t xml:space="preserve">Цель </w:t>
-      </w:r>
-      <w:proofErr w:type="spellStart"/>
-      <w:r>
-        <w:rPr>
-          <w:b/>
-          <w:color w:val="000000"/>
-          <w:sz w:val="32"/>
-        </w:rPr>
-        <w:t>работы</w:t>
-      </w:r>
-      <w:proofErr w:type="spellEnd"/>
+        <w:t>1.Цель работы</w:t>
+      </w:r>
     </w:p>
     <w:p>
       <w:pPr>
@@ -417,12 +361,16 @@
       <w:pPr>
         <w:keepNext/>
         <w:spacing w:before="100" w:after="100"/>
+        <w:rPr>
+          <w:lang w:val="ru-RU"/>
+        </w:rPr>
       </w:pPr>
       <w:r>
         <w:rPr>
           <w:b/>
           <w:color w:val="000000"/>
           <w:sz w:val="32"/>
+          <w:lang w:val="ru-RU"/>
         </w:rPr>
         <w:t>2</w:t>
       </w:r>
@@ -431,6 +379,7 @@
           <w:b/>
           <w:color w:val="000000"/>
           <w:sz w:val="32"/>
+          <w:lang w:val="ru-RU"/>
         </w:rPr>
         <w:t>.</w:t>
       </w:r>
@@ -439,655 +388,27 @@
           <w:b/>
           <w:color w:val="000000"/>
           <w:sz w:val="32"/>
+          <w:lang w:val="ru-RU"/>
         </w:rPr>
         <w:t xml:space="preserve"> </w:t>
       </w:r>
-      <w:proofErr w:type="spellStart"/>
+      <w:proofErr w:type="gramStart"/>
       <w:r>
         <w:rPr>
           <w:b/>
           <w:color w:val="000000"/>
           <w:sz w:val="32"/>
-        </w:rPr>
-        <w:t>Выполнение</w:t>
-      </w:r>
-      <w:proofErr w:type="spellEnd"/>
+          <w:lang w:val="ru-RU"/>
+        </w:rPr>
+        <w:t>Задание  Разрешение</w:t>
+      </w:r>
+      <w:proofErr w:type="gramEnd"/>
       <w:r>
         <w:rPr>
           <w:b/>
           <w:color w:val="000000"/>
           <w:sz w:val="32"/>
-        </w:rPr>
-        <w:t xml:space="preserve"> </w:t>
-      </w:r>
-      <w:proofErr w:type="spellStart"/>
-      <w:r>
-        <w:rPr>
-          <w:b/>
-          <w:color w:val="000000"/>
-          <w:sz w:val="32"/>
-        </w:rPr>
-        <w:t>обязательных</w:t>
-      </w:r>
-      <w:proofErr w:type="spellEnd"/>
-      <w:r>
-        <w:rPr>
-          <w:b/>
-          <w:color w:val="000000"/>
-          <w:sz w:val="32"/>
-        </w:rPr>
-        <w:t xml:space="preserve"> </w:t>
-      </w:r>
-      <w:proofErr w:type="spellStart"/>
-      <w:r>
-        <w:rPr>
-          <w:b/>
-          <w:color w:val="000000"/>
-          <w:sz w:val="32"/>
-        </w:rPr>
-        <w:t>заданий</w:t>
-      </w:r>
-      <w:proofErr w:type="spellEnd"/>
-    </w:p>
-    <w:tbl>
-      <w:tblPr>
-        <w:tblW w:w="0" w:type="auto"/>
-        <w:jc w:val="center"/>
-        <w:tblBorders>
-          <w:top w:val="single" w:sz="8" w:space="0" w:color="D9D9D9"/>
-          <w:left w:val="single" w:sz="8" w:space="0" w:color="D9D9D9"/>
-          <w:bottom w:val="single" w:sz="8" w:space="0" w:color="D9D9D9"/>
-          <w:right w:val="single" w:sz="8" w:space="0" w:color="D9D9D9"/>
-          <w:insideH w:val="single" w:sz="8" w:space="0" w:color="D9D9D9"/>
-          <w:insideV w:val="single" w:sz="8" w:space="0" w:color="D9D9D9"/>
-        </w:tblBorders>
-        <w:tblLayout w:type="fixed"/>
-        <w:tblLook w:val="04A0" w:firstRow="1" w:lastRow="0" w:firstColumn="1" w:lastColumn="0" w:noHBand="0" w:noVBand="1"/>
-      </w:tblPr>
-      <w:tblGrid>
-        <w:gridCol w:w="792"/>
-        <w:gridCol w:w="7128"/>
-        <w:gridCol w:w="1440"/>
-      </w:tblGrid>
-      <w:tr>
-        <w:trPr>
-          <w:tblHeader/>
-          <w:jc w:val="center"/>
-        </w:trPr>
-        <w:tc>
-          <w:tcPr>
-            <w:tcW w:w="792" w:type="dxa"/>
-            <w:shd w:val="clear" w:color="auto" w:fill="1F4E79"/>
-            <w:tcMar>
-              <w:top w:w="110" w:type="dxa"/>
-              <w:left w:w="120" w:type="dxa"/>
-              <w:bottom w:w="110" w:type="dxa"/>
-              <w:right w:w="120" w:type="dxa"/>
-            </w:tcMar>
-            <w:vAlign w:val="center"/>
-          </w:tcPr>
-          <w:p>
-            <w:pPr>
-              <w:spacing w:after="0" w:line="252" w:lineRule="auto"/>
-              <w:jc w:val="center"/>
-            </w:pPr>
-            <w:r>
-              <w:rPr>
-                <w:b/>
-                <w:color w:val="FFFFFF"/>
-                <w:sz w:val="20"/>
-              </w:rPr>
-              <w:t>№</w:t>
-            </w:r>
-          </w:p>
-        </w:tc>
-        <w:tc>
-          <w:tcPr>
-            <w:tcW w:w="7128" w:type="dxa"/>
-            <w:shd w:val="clear" w:color="auto" w:fill="1F4E79"/>
-            <w:tcMar>
-              <w:top w:w="110" w:type="dxa"/>
-              <w:left w:w="120" w:type="dxa"/>
-              <w:bottom w:w="110" w:type="dxa"/>
-              <w:right w:w="120" w:type="dxa"/>
-            </w:tcMar>
-            <w:vAlign w:val="center"/>
-          </w:tcPr>
-          <w:p>
-            <w:pPr>
-              <w:spacing w:after="0" w:line="252" w:lineRule="auto"/>
-              <w:jc w:val="center"/>
-            </w:pPr>
-            <w:r>
-              <w:rPr>
-                <w:b/>
-                <w:color w:val="FFFFFF"/>
-                <w:sz w:val="20"/>
-              </w:rPr>
-              <w:t>Требование</w:t>
-            </w:r>
-          </w:p>
-        </w:tc>
-        <w:tc>
-          <w:tcPr>
-            <w:tcW w:w="1440" w:type="dxa"/>
-            <w:shd w:val="clear" w:color="auto" w:fill="1F4E79"/>
-            <w:tcMar>
-              <w:top w:w="110" w:type="dxa"/>
-              <w:left w:w="120" w:type="dxa"/>
-              <w:bottom w:w="110" w:type="dxa"/>
-              <w:right w:w="120" w:type="dxa"/>
-            </w:tcMar>
-            <w:vAlign w:val="center"/>
-          </w:tcPr>
-          <w:p>
-            <w:pPr>
-              <w:spacing w:after="0" w:line="252" w:lineRule="auto"/>
-              <w:jc w:val="center"/>
-            </w:pPr>
-            <w:r>
-              <w:rPr>
-                <w:b/>
-                <w:color w:val="FFFFFF"/>
-                <w:sz w:val="20"/>
-              </w:rPr>
-              <w:t>Результат</w:t>
-            </w:r>
-          </w:p>
-        </w:tc>
-      </w:tr>
-      <w:tr>
-        <w:trPr>
-          <w:jc w:val="center"/>
-        </w:trPr>
-        <w:tc>
-          <w:tcPr>
-            <w:tcW w:w="792" w:type="dxa"/>
-            <w:tcMar>
-              <w:top w:w="110" w:type="dxa"/>
-              <w:left w:w="120" w:type="dxa"/>
-              <w:bottom w:w="110" w:type="dxa"/>
-              <w:right w:w="120" w:type="dxa"/>
-            </w:tcMar>
-            <w:vAlign w:val="center"/>
-          </w:tcPr>
-          <w:p>
-            <w:pPr>
-              <w:spacing w:after="0" w:line="252" w:lineRule="auto"/>
-              <w:jc w:val="center"/>
-            </w:pPr>
-            <w:r>
-              <w:rPr>
-                <w:color w:val="000000"/>
-                <w:sz w:val="19"/>
-              </w:rPr>
-              <w:t>1</w:t>
-            </w:r>
-          </w:p>
-        </w:tc>
-        <w:tc>
-          <w:tcPr>
-            <w:tcW w:w="7128" w:type="dxa"/>
-            <w:tcMar>
-              <w:top w:w="110" w:type="dxa"/>
-              <w:left w:w="120" w:type="dxa"/>
-              <w:bottom w:w="110" w:type="dxa"/>
-              <w:right w:w="120" w:type="dxa"/>
-            </w:tcMar>
-            <w:vAlign w:val="center"/>
-          </w:tcPr>
-          <w:p>
-            <w:pPr>
-              <w:spacing w:after="0" w:line="252" w:lineRule="auto"/>
-              <w:rPr>
-                <w:lang w:val="ru-RU"/>
-              </w:rPr>
-            </w:pPr>
-            <w:r>
-              <w:rPr>
-                <w:color w:val="000000"/>
-                <w:sz w:val="19"/>
-                <w:lang w:val="ru-RU"/>
-              </w:rPr>
-              <w:t>Создать конфликт веток и разрешить его объединением изменений</w:t>
-            </w:r>
-          </w:p>
-        </w:tc>
-        <w:tc>
-          <w:tcPr>
-            <w:tcW w:w="1440" w:type="dxa"/>
-            <w:tcMar>
-              <w:top w:w="110" w:type="dxa"/>
-              <w:left w:w="120" w:type="dxa"/>
-              <w:bottom w:w="110" w:type="dxa"/>
-              <w:right w:w="120" w:type="dxa"/>
-            </w:tcMar>
-            <w:vAlign w:val="center"/>
-          </w:tcPr>
-          <w:p>
-            <w:pPr>
-              <w:spacing w:after="0" w:line="252" w:lineRule="auto"/>
-              <w:jc w:val="center"/>
-            </w:pPr>
-            <w:proofErr w:type="spellStart"/>
-            <w:r>
-              <w:rPr>
-                <w:color w:val="000000"/>
-                <w:sz w:val="19"/>
-              </w:rPr>
-              <w:t>Выполнено</w:t>
-            </w:r>
-            <w:proofErr w:type="spellEnd"/>
-          </w:p>
-        </w:tc>
-      </w:tr>
-      <w:tr>
-        <w:trPr>
-          <w:jc w:val="center"/>
-        </w:trPr>
-        <w:tc>
-          <w:tcPr>
-            <w:tcW w:w="792" w:type="dxa"/>
-            <w:shd w:val="clear" w:color="auto" w:fill="EAF2F8"/>
-            <w:tcMar>
-              <w:top w:w="110" w:type="dxa"/>
-              <w:left w:w="120" w:type="dxa"/>
-              <w:bottom w:w="110" w:type="dxa"/>
-              <w:right w:w="120" w:type="dxa"/>
-            </w:tcMar>
-            <w:vAlign w:val="center"/>
-          </w:tcPr>
-          <w:p>
-            <w:pPr>
-              <w:spacing w:after="0" w:line="252" w:lineRule="auto"/>
-              <w:jc w:val="center"/>
-            </w:pPr>
-            <w:r>
-              <w:rPr>
-                <w:color w:val="000000"/>
-                <w:sz w:val="19"/>
-              </w:rPr>
-              <w:t>2</w:t>
-            </w:r>
-          </w:p>
-        </w:tc>
-        <w:tc>
-          <w:tcPr>
-            <w:tcW w:w="7128" w:type="dxa"/>
-            <w:shd w:val="clear" w:color="auto" w:fill="EAF2F8"/>
-            <w:tcMar>
-              <w:top w:w="110" w:type="dxa"/>
-              <w:left w:w="120" w:type="dxa"/>
-              <w:bottom w:w="110" w:type="dxa"/>
-              <w:right w:w="120" w:type="dxa"/>
-            </w:tcMar>
-            <w:vAlign w:val="center"/>
-          </w:tcPr>
-          <w:p>
-            <w:pPr>
-              <w:spacing w:after="0" w:line="252" w:lineRule="auto"/>
-              <w:rPr>
-                <w:lang w:val="ru-RU"/>
-              </w:rPr>
-            </w:pPr>
-            <w:r>
-              <w:rPr>
-                <w:color w:val="000000"/>
-                <w:sz w:val="19"/>
-                <w:lang w:val="ru-RU"/>
-              </w:rPr>
-              <w:t xml:space="preserve">Сравнить историю после </w:t>
-            </w:r>
-            <w:r>
-              <w:rPr>
-                <w:color w:val="000000"/>
-                <w:sz w:val="19"/>
-              </w:rPr>
-              <w:t>merge</w:t>
-            </w:r>
-            <w:r>
-              <w:rPr>
-                <w:color w:val="000000"/>
-                <w:sz w:val="19"/>
-                <w:lang w:val="ru-RU"/>
-              </w:rPr>
-              <w:t xml:space="preserve"> и после </w:t>
-            </w:r>
-            <w:r>
-              <w:rPr>
-                <w:color w:val="000000"/>
-                <w:sz w:val="19"/>
-              </w:rPr>
-              <w:t>rebase</w:t>
-            </w:r>
-          </w:p>
-        </w:tc>
-        <w:tc>
-          <w:tcPr>
-            <w:tcW w:w="1440" w:type="dxa"/>
-            <w:shd w:val="clear" w:color="auto" w:fill="EAF2F8"/>
-            <w:tcMar>
-              <w:top w:w="110" w:type="dxa"/>
-              <w:left w:w="120" w:type="dxa"/>
-              <w:bottom w:w="110" w:type="dxa"/>
-              <w:right w:w="120" w:type="dxa"/>
-            </w:tcMar>
-            <w:vAlign w:val="center"/>
-          </w:tcPr>
-          <w:p>
-            <w:pPr>
-              <w:spacing w:after="0" w:line="252" w:lineRule="auto"/>
-              <w:jc w:val="center"/>
-            </w:pPr>
-            <w:proofErr w:type="spellStart"/>
-            <w:r>
-              <w:rPr>
-                <w:color w:val="000000"/>
-                <w:sz w:val="19"/>
-              </w:rPr>
-              <w:t>Выполнено</w:t>
-            </w:r>
-            <w:proofErr w:type="spellEnd"/>
-          </w:p>
-        </w:tc>
-      </w:tr>
-      <w:tr>
-        <w:trPr>
-          <w:jc w:val="center"/>
-        </w:trPr>
-        <w:tc>
-          <w:tcPr>
-            <w:tcW w:w="792" w:type="dxa"/>
-            <w:tcMar>
-              <w:top w:w="110" w:type="dxa"/>
-              <w:left w:w="120" w:type="dxa"/>
-              <w:bottom w:w="110" w:type="dxa"/>
-              <w:right w:w="120" w:type="dxa"/>
-            </w:tcMar>
-            <w:vAlign w:val="center"/>
-          </w:tcPr>
-          <w:p>
-            <w:pPr>
-              <w:spacing w:after="0" w:line="252" w:lineRule="auto"/>
-              <w:jc w:val="center"/>
-            </w:pPr>
-            <w:r>
-              <w:rPr>
-                <w:color w:val="000000"/>
-                <w:sz w:val="19"/>
-              </w:rPr>
-              <w:t>3</w:t>
-            </w:r>
-          </w:p>
-        </w:tc>
-        <w:tc>
-          <w:tcPr>
-            <w:tcW w:w="7128" w:type="dxa"/>
-            <w:tcMar>
-              <w:top w:w="110" w:type="dxa"/>
-              <w:left w:w="120" w:type="dxa"/>
-              <w:bottom w:w="110" w:type="dxa"/>
-              <w:right w:w="120" w:type="dxa"/>
-            </w:tcMar>
-            <w:vAlign w:val="center"/>
-          </w:tcPr>
-          <w:p>
-            <w:pPr>
-              <w:spacing w:after="0" w:line="252" w:lineRule="auto"/>
-              <w:rPr>
-                <w:lang w:val="ru-RU"/>
-              </w:rPr>
-            </w:pPr>
-            <w:r>
-              <w:rPr>
-                <w:color w:val="000000"/>
-                <w:sz w:val="19"/>
-                <w:lang w:val="ru-RU"/>
-              </w:rPr>
-              <w:t>Сократить шесть неаккуратных коммитов до трёх</w:t>
-            </w:r>
-          </w:p>
-        </w:tc>
-        <w:tc>
-          <w:tcPr>
-            <w:tcW w:w="1440" w:type="dxa"/>
-            <w:tcMar>
-              <w:top w:w="110" w:type="dxa"/>
-              <w:left w:w="120" w:type="dxa"/>
-              <w:bottom w:w="110" w:type="dxa"/>
-              <w:right w:w="120" w:type="dxa"/>
-            </w:tcMar>
-            <w:vAlign w:val="center"/>
-          </w:tcPr>
-          <w:p>
-            <w:pPr>
-              <w:spacing w:after="0" w:line="252" w:lineRule="auto"/>
-              <w:jc w:val="center"/>
-            </w:pPr>
-            <w:proofErr w:type="spellStart"/>
-            <w:r>
-              <w:rPr>
-                <w:color w:val="000000"/>
-                <w:sz w:val="19"/>
-              </w:rPr>
-              <w:t>Выполнено</w:t>
-            </w:r>
-            <w:proofErr w:type="spellEnd"/>
-          </w:p>
-        </w:tc>
-      </w:tr>
-      <w:tr>
-        <w:trPr>
-          <w:jc w:val="center"/>
-        </w:trPr>
-        <w:tc>
-          <w:tcPr>
-            <w:tcW w:w="792" w:type="dxa"/>
-            <w:shd w:val="clear" w:color="auto" w:fill="EAF2F8"/>
-            <w:tcMar>
-              <w:top w:w="110" w:type="dxa"/>
-              <w:left w:w="120" w:type="dxa"/>
-              <w:bottom w:w="110" w:type="dxa"/>
-              <w:right w:w="120" w:type="dxa"/>
-            </w:tcMar>
-            <w:vAlign w:val="center"/>
-          </w:tcPr>
-          <w:p>
-            <w:pPr>
-              <w:spacing w:after="0" w:line="252" w:lineRule="auto"/>
-              <w:jc w:val="center"/>
-            </w:pPr>
-            <w:r>
-              <w:rPr>
-                <w:color w:val="000000"/>
-                <w:sz w:val="19"/>
-              </w:rPr>
-              <w:t>4</w:t>
-            </w:r>
-          </w:p>
-        </w:tc>
-        <w:tc>
-          <w:tcPr>
-            <w:tcW w:w="7128" w:type="dxa"/>
-            <w:shd w:val="clear" w:color="auto" w:fill="EAF2F8"/>
-            <w:tcMar>
-              <w:top w:w="110" w:type="dxa"/>
-              <w:left w:w="120" w:type="dxa"/>
-              <w:bottom w:w="110" w:type="dxa"/>
-              <w:right w:w="120" w:type="dxa"/>
-            </w:tcMar>
-            <w:vAlign w:val="center"/>
-          </w:tcPr>
-          <w:p>
-            <w:pPr>
-              <w:spacing w:after="0" w:line="252" w:lineRule="auto"/>
-              <w:rPr>
-                <w:lang w:val="ru-RU"/>
-              </w:rPr>
-            </w:pPr>
-            <w:r>
-              <w:rPr>
-                <w:color w:val="000000"/>
-                <w:sz w:val="19"/>
-                <w:lang w:val="ru-RU"/>
-              </w:rPr>
-              <w:t>Настроить работу с двумя удалёнными репозиториями</w:t>
-            </w:r>
-          </w:p>
-        </w:tc>
-        <w:tc>
-          <w:tcPr>
-            <w:tcW w:w="1440" w:type="dxa"/>
-            <w:shd w:val="clear" w:color="auto" w:fill="EAF2F8"/>
-            <w:tcMar>
-              <w:top w:w="110" w:type="dxa"/>
-              <w:left w:w="120" w:type="dxa"/>
-              <w:bottom w:w="110" w:type="dxa"/>
-              <w:right w:w="120" w:type="dxa"/>
-            </w:tcMar>
-            <w:vAlign w:val="center"/>
-          </w:tcPr>
-          <w:p>
-            <w:pPr>
-              <w:spacing w:after="0" w:line="252" w:lineRule="auto"/>
-              <w:jc w:val="center"/>
-            </w:pPr>
-            <w:proofErr w:type="spellStart"/>
-            <w:r>
-              <w:rPr>
-                <w:color w:val="000000"/>
-                <w:sz w:val="19"/>
-              </w:rPr>
-              <w:t>Выполнено</w:t>
-            </w:r>
-            <w:proofErr w:type="spellEnd"/>
-          </w:p>
-        </w:tc>
-      </w:tr>
-      <w:tr>
-        <w:trPr>
-          <w:jc w:val="center"/>
-        </w:trPr>
-        <w:tc>
-          <w:tcPr>
-            <w:tcW w:w="792" w:type="dxa"/>
-            <w:tcMar>
-              <w:top w:w="110" w:type="dxa"/>
-              <w:left w:w="120" w:type="dxa"/>
-              <w:bottom w:w="110" w:type="dxa"/>
-              <w:right w:w="120" w:type="dxa"/>
-            </w:tcMar>
-            <w:vAlign w:val="center"/>
-          </w:tcPr>
-          <w:p>
-            <w:pPr>
-              <w:spacing w:after="0" w:line="252" w:lineRule="auto"/>
-              <w:jc w:val="center"/>
-            </w:pPr>
-            <w:r>
-              <w:rPr>
-                <w:color w:val="000000"/>
-                <w:sz w:val="19"/>
-              </w:rPr>
-              <w:t>5</w:t>
-            </w:r>
-          </w:p>
-        </w:tc>
-        <w:tc>
-          <w:tcPr>
-            <w:tcW w:w="7128" w:type="dxa"/>
-            <w:tcMar>
-              <w:top w:w="110" w:type="dxa"/>
-              <w:left w:w="120" w:type="dxa"/>
-              <w:bottom w:w="110" w:type="dxa"/>
-              <w:right w:w="120" w:type="dxa"/>
-            </w:tcMar>
-            <w:vAlign w:val="center"/>
-          </w:tcPr>
-          <w:p>
-            <w:pPr>
-              <w:spacing w:after="0" w:line="252" w:lineRule="auto"/>
-            </w:pPr>
-            <w:r>
-              <w:rPr>
-                <w:color w:val="000000"/>
-                <w:sz w:val="19"/>
-              </w:rPr>
-              <w:t>Применить cherry-pick, reflog и revert</w:t>
-            </w:r>
-          </w:p>
-        </w:tc>
-        <w:tc>
-          <w:tcPr>
-            <w:tcW w:w="1440" w:type="dxa"/>
-            <w:tcMar>
-              <w:top w:w="110" w:type="dxa"/>
-              <w:left w:w="120" w:type="dxa"/>
-              <w:bottom w:w="110" w:type="dxa"/>
-              <w:right w:w="120" w:type="dxa"/>
-            </w:tcMar>
-            <w:vAlign w:val="center"/>
-          </w:tcPr>
-          <w:p>
-            <w:pPr>
-              <w:spacing w:after="0" w:line="252" w:lineRule="auto"/>
-              <w:jc w:val="center"/>
-            </w:pPr>
-            <w:r>
-              <w:rPr>
-                <w:color w:val="000000"/>
-                <w:sz w:val="19"/>
-              </w:rPr>
-              <w:t>Выполнено</w:t>
-            </w:r>
-          </w:p>
-        </w:tc>
-      </w:tr>
-    </w:tbl>
-    <w:p>
-      <w:pPr>
-        <w:keepNext/>
-        <w:spacing w:before="100" w:after="100"/>
-      </w:pPr>
-      <w:r>
-        <w:rPr>
-          <w:b/>
-          <w:color w:val="000000"/>
-          <w:sz w:val="32"/>
-        </w:rPr>
-        <w:t>3</w:t>
-      </w:r>
-      <w:r>
-        <w:rPr>
-          <w:b/>
-          <w:color w:val="000000"/>
-          <w:sz w:val="32"/>
-        </w:rPr>
-        <w:t>.</w:t>
-      </w:r>
-      <w:r>
-        <w:rPr>
-          <w:b/>
-          <w:color w:val="000000"/>
-          <w:sz w:val="32"/>
-        </w:rPr>
-        <w:t xml:space="preserve"> </w:t>
-      </w:r>
-      <w:proofErr w:type="gramStart"/>
-      <w:r>
-        <w:rPr>
-          <w:b/>
-          <w:color w:val="000000"/>
-          <w:sz w:val="32"/>
-        </w:rPr>
-        <w:t>Задание  Разрешение</w:t>
-      </w:r>
-      <w:proofErr w:type="gramEnd"/>
-      <w:r>
-        <w:rPr>
-          <w:b/>
-          <w:color w:val="000000"/>
-          <w:sz w:val="32"/>
+          <w:lang w:val="ru-RU"/>
         </w:rPr>
         <w:t xml:space="preserve"> конфликта</w:t>
       </w:r>
@@ -1269,7 +590,6 @@
           <w:sz w:val="32"/>
           <w:lang w:val="ru-RU"/>
         </w:rPr>
-        <w:lastRenderedPageBreak/>
         <w:t>Разрешение конфликта продолжение</w:t>
       </w:r>
     </w:p>
@@ -1339,6 +659,7 @@
         <w:rPr>
           <w:noProof/>
         </w:rPr>
+        <w:lastRenderedPageBreak/>
         <w:drawing>
           <wp:inline distT="0" distB="0" distL="0" distR="0" wp14:anchorId="60E18A90" wp14:editId="478D9433">
             <wp:extent cx="5760720" cy="3885286"/>
@@ -1440,13 +761,14 @@
           <w:lang w:val="ru-RU"/>
         </w:rPr>
         <w:lastRenderedPageBreak/>
-        <w:t>4</w:t>
+        <w:t>3</w:t>
       </w:r>
       <w:r>
         <w:rPr>
           <w:b/>
           <w:color w:val="000000"/>
           <w:sz w:val="32"/>
+          <w:lang w:val="ru-RU"/>
         </w:rPr>
         <w:t>.</w:t>
       </w:r>
@@ -1874,13 +1196,14 @@
           <w:lang w:val="ru-RU"/>
         </w:rPr>
         <w:lastRenderedPageBreak/>
-        <w:t>5</w:t>
+        <w:t>4</w:t>
       </w:r>
       <w:r>
         <w:rPr>
           <w:b/>
           <w:color w:val="000000"/>
           <w:sz w:val="32"/>
+          <w:lang w:val="ru-RU"/>
         </w:rPr>
         <w:t>.</w:t>
       </w:r>
@@ -2322,13 +1645,14 @@
           <w:lang w:val="ru-RU"/>
         </w:rPr>
         <w:lastRenderedPageBreak/>
-        <w:t>6</w:t>
+        <w:t>5</w:t>
       </w:r>
       <w:r>
         <w:rPr>
           <w:b/>
           <w:color w:val="000000"/>
           <w:sz w:val="32"/>
+          <w:lang w:val="ru-RU"/>
         </w:rPr>
         <w:t>.</w:t>
       </w:r>
@@ -2356,137 +1680,117 @@
           <w:color w:val="000000"/>
           <w:lang w:val="ru-RU"/>
         </w:rPr>
-        <w:t xml:space="preserve">В качестве второго удалённого хранилища создан публичный зеркальный репозиторий </w:t>
-      </w:r>
-      <w:r>
-        <w:rPr>
-          <w:color w:val="000000"/>
-        </w:rPr>
-        <w:t>GitHub</w:t>
-      </w:r>
-      <w:r>
-        <w:rPr>
-          <w:color w:val="000000"/>
-          <w:lang w:val="ru-RU"/>
-        </w:rPr>
-        <w:t xml:space="preserve">. Для наглядности он добавлен как </w:t>
-      </w:r>
-      <w:r>
-        <w:rPr>
-          <w:color w:val="000000"/>
-        </w:rPr>
-        <w:t>remote</w:t>
-      </w:r>
-      <w:r>
-        <w:rPr>
-          <w:color w:val="000000"/>
-          <w:lang w:val="ru-RU"/>
-        </w:rPr>
-        <w:t xml:space="preserve"> </w:t>
-      </w:r>
-      <w:r>
-        <w:rPr>
-          <w:color w:val="000000"/>
-        </w:rPr>
-        <w:t>mirror</w:t>
-      </w:r>
-      <w:r>
-        <w:rPr>
-          <w:color w:val="000000"/>
-          <w:lang w:val="ru-RU"/>
-        </w:rPr>
-        <w:t xml:space="preserve">. Кроме того, для </w:t>
-      </w:r>
-      <w:r>
-        <w:rPr>
-          <w:color w:val="000000"/>
-        </w:rPr>
-        <w:t>origin</w:t>
-      </w:r>
-      <w:r>
-        <w:rPr>
-          <w:color w:val="000000"/>
-          <w:lang w:val="ru-RU"/>
-        </w:rPr>
-        <w:t xml:space="preserve"> настроены два </w:t>
-      </w:r>
-      <w:r>
-        <w:rPr>
-          <w:color w:val="000000"/>
-        </w:rPr>
-        <w:t>push</w:t>
-      </w:r>
-      <w:r>
-        <w:rPr>
-          <w:color w:val="000000"/>
-          <w:lang w:val="ru-RU"/>
-        </w:rPr>
-        <w:t xml:space="preserve"> </w:t>
-      </w:r>
-      <w:r>
-        <w:rPr>
-          <w:color w:val="000000"/>
-        </w:rPr>
-        <w:t>URL</w:t>
-      </w:r>
-      <w:r>
-        <w:rPr>
-          <w:color w:val="000000"/>
-          <w:lang w:val="ru-RU"/>
-        </w:rPr>
-        <w:t xml:space="preserve">, поэтому одна команда </w:t>
-      </w:r>
-      <w:r>
-        <w:rPr>
-          <w:color w:val="000000"/>
-        </w:rPr>
-        <w:t>git</w:t>
-      </w:r>
-      <w:r>
-        <w:rPr>
-          <w:color w:val="000000"/>
-          <w:lang w:val="ru-RU"/>
-        </w:rPr>
-        <w:t xml:space="preserve"> </w:t>
-      </w:r>
-      <w:r>
-        <w:rPr>
-          <w:color w:val="000000"/>
-        </w:rPr>
-        <w:t>push</w:t>
-      </w:r>
-      <w:r>
-        <w:rPr>
-          <w:color w:val="000000"/>
-          <w:lang w:val="ru-RU"/>
-        </w:rPr>
-        <w:t xml:space="preserve"> </w:t>
-      </w:r>
-      <w:r>
-        <w:rPr>
-          <w:color w:val="000000"/>
-        </w:rPr>
-        <w:t>origin</w:t>
-      </w:r>
-      <w:r>
-        <w:rPr>
-          <w:color w:val="000000"/>
-          <w:lang w:val="ru-RU"/>
-        </w:rPr>
-        <w:t xml:space="preserve"> </w:t>
-      </w:r>
-      <w:r>
-        <w:rPr>
-          <w:color w:val="000000"/>
-        </w:rPr>
-        <w:t>main</w:t>
-      </w:r>
-      <w:r>
-        <w:rPr>
-          <w:color w:val="000000"/>
-          <w:lang w:val="ru-RU"/>
-        </w:rPr>
-        <w:t xml:space="preserve"> отправляет изменения сразу в основной репозиторий и в зеркало.</w:t>
+        <w:t>В качестве второго удалённого хранилища создан зеркальный репозиторий GitLab с именем devops-course-2026-mirror. Он добавлен как remote gitlab. Для origin настроены два push URL, поэтому одна команда git push origin main отправляет изменения сразу в основной репозиторий GitHub и в зеркало GitLab.</w:t>
+      </w:r>
+      <w:r>
+        <w:rPr>
+          <w:color w:val="000000"/>
+        </w:rPr>
+      </w:r>
+      <w:r>
+        <w:rPr>
+          <w:color w:val="000000"/>
+          <w:lang w:val="ru-RU"/>
+        </w:rPr>
+      </w:r>
+      <w:r>
+        <w:rPr>
+          <w:color w:val="000000"/>
+        </w:rPr>
+      </w:r>
+      <w:r>
+        <w:rPr>
+          <w:color w:val="000000"/>
+          <w:lang w:val="ru-RU"/>
+        </w:rPr>
+      </w:r>
+      <w:r>
+        <w:rPr>
+          <w:color w:val="000000"/>
+        </w:rPr>
+      </w:r>
+      <w:r>
+        <w:rPr>
+          <w:color w:val="000000"/>
+          <w:lang w:val="ru-RU"/>
+        </w:rPr>
+      </w:r>
+      <w:r>
+        <w:rPr>
+          <w:color w:val="000000"/>
+        </w:rPr>
+      </w:r>
+      <w:r>
+        <w:rPr>
+          <w:color w:val="000000"/>
+          <w:lang w:val="ru-RU"/>
+        </w:rPr>
+      </w:r>
+      <w:r>
+        <w:rPr>
+          <w:color w:val="000000"/>
+        </w:rPr>
+      </w:r>
+      <w:r>
+        <w:rPr>
+          <w:color w:val="000000"/>
+          <w:lang w:val="ru-RU"/>
+        </w:rPr>
+      </w:r>
+      <w:r>
+        <w:rPr>
+          <w:color w:val="000000"/>
+        </w:rPr>
+      </w:r>
+      <w:r>
+        <w:rPr>
+          <w:color w:val="000000"/>
+          <w:lang w:val="ru-RU"/>
+        </w:rPr>
+      </w:r>
+      <w:r>
+        <w:rPr>
+          <w:color w:val="000000"/>
+        </w:rPr>
+      </w:r>
+      <w:r>
+        <w:rPr>
+          <w:color w:val="000000"/>
+          <w:lang w:val="ru-RU"/>
+        </w:rPr>
+      </w:r>
+      <w:r>
+        <w:rPr>
+          <w:color w:val="000000"/>
+        </w:rPr>
+      </w:r>
+      <w:r>
+        <w:rPr>
+          <w:color w:val="000000"/>
+          <w:lang w:val="ru-RU"/>
+        </w:rPr>
+      </w:r>
+      <w:r>
+        <w:rPr>
+          <w:color w:val="000000"/>
+        </w:rPr>
+      </w:r>
+      <w:r>
+        <w:rPr>
+          <w:color w:val="000000"/>
+          <w:lang w:val="ru-RU"/>
+        </w:rPr>
+      </w:r>
+      <w:r>
+        <w:rPr>
+          <w:color w:val="000000"/>
+        </w:rPr>
+      </w:r>
+      <w:r>
+        <w:rPr>
+          <w:color w:val="000000"/>
+          <w:lang w:val="ru-RU"/>
+        </w:rPr>
       </w:r>
     </w:p>
     <w:p>
@@ -2568,98 +1872,84 @@
           <w:color w:val="000000"/>
           <w:lang w:val="ru-RU"/>
         </w:rPr>
-        <w:t xml:space="preserve">После отправки оба репозитория открыты в браузере. В основном репозитории и зеркале присутствует один и тот же коммит </w:t>
-      </w:r>
-      <w:r>
-        <w:rPr>
-          <w:color w:val="000000"/>
-        </w:rPr>
-        <w:t>bd</w:t>
-      </w:r>
-      <w:r>
-        <w:rPr>
-          <w:color w:val="000000"/>
-          <w:lang w:val="ru-RU"/>
-        </w:rPr>
-        <w:t>518</w:t>
-      </w:r>
-      <w:r>
-        <w:rPr>
-          <w:color w:val="000000"/>
-        </w:rPr>
-        <w:t>b</w:t>
-      </w:r>
-      <w:r>
-        <w:rPr>
-          <w:color w:val="000000"/>
-          <w:lang w:val="ru-RU"/>
-        </w:rPr>
-        <w:t xml:space="preserve">5 с сообщением </w:t>
-      </w:r>
-      <w:r>
-        <w:rPr>
-          <w:color w:val="000000"/>
-        </w:rPr>
-        <w:t>chore</w:t>
-      </w:r>
-      <w:r>
-        <w:rPr>
-          <w:color w:val="000000"/>
-          <w:lang w:val="ru-RU"/>
-        </w:rPr>
-        <w:t xml:space="preserve">: </w:t>
-      </w:r>
-      <w:r>
-        <w:rPr>
-          <w:color w:val="000000"/>
-        </w:rPr>
-        <w:t>test</w:t>
-      </w:r>
-      <w:r>
-        <w:rPr>
-          <w:color w:val="000000"/>
-          <w:lang w:val="ru-RU"/>
-        </w:rPr>
-        <w:t xml:space="preserve"> </w:t>
-      </w:r>
-      <w:r>
-        <w:rPr>
-          <w:color w:val="000000"/>
-        </w:rPr>
-        <w:t>multi</w:t>
-      </w:r>
-      <w:r>
-        <w:rPr>
-          <w:color w:val="000000"/>
-          <w:lang w:val="ru-RU"/>
-        </w:rPr>
-        <w:t>-</w:t>
-      </w:r>
-      <w:r>
-        <w:rPr>
-          <w:color w:val="000000"/>
-        </w:rPr>
-        <w:t>remote</w:t>
-      </w:r>
-      <w:r>
-        <w:rPr>
-          <w:color w:val="000000"/>
-          <w:lang w:val="ru-RU"/>
-        </w:rPr>
-        <w:t xml:space="preserve"> </w:t>
-      </w:r>
-      <w:r>
-        <w:rPr>
-          <w:color w:val="000000"/>
-        </w:rPr>
-        <w:t>push</w:t>
-      </w:r>
-      <w:r>
-        <w:rPr>
-          <w:color w:val="000000"/>
-          <w:lang w:val="ru-RU"/>
-        </w:rPr>
-        <w:t>, что подтверждает успешную синхронизацию.</w:t>
+        <w:t>После отправки оба репозитория открыты в браузере. В основном репозитории GitHub и зеркале GitLab присутствует один и тот же коммит bd518b5 с сообщением chore: test multi-remote push, что подтверждает успешную синхронизацию.</w:t>
+      </w:r>
+      <w:r>
+        <w:rPr>
+          <w:color w:val="000000"/>
+        </w:rPr>
+      </w:r>
+      <w:r>
+        <w:rPr>
+          <w:color w:val="000000"/>
+          <w:lang w:val="ru-RU"/>
+        </w:rPr>
+      </w:r>
+      <w:r>
+        <w:rPr>
+          <w:color w:val="000000"/>
+        </w:rPr>
+      </w:r>
+      <w:r>
+        <w:rPr>
+          <w:color w:val="000000"/>
+          <w:lang w:val="ru-RU"/>
+        </w:rPr>
+      </w:r>
+      <w:r>
+        <w:rPr>
+          <w:color w:val="000000"/>
+        </w:rPr>
+      </w:r>
+      <w:r>
+        <w:rPr>
+          <w:color w:val="000000"/>
+          <w:lang w:val="ru-RU"/>
+        </w:rPr>
+      </w:r>
+      <w:r>
+        <w:rPr>
+          <w:color w:val="000000"/>
+        </w:rPr>
+      </w:r>
+      <w:r>
+        <w:rPr>
+          <w:color w:val="000000"/>
+          <w:lang w:val="ru-RU"/>
+        </w:rPr>
+      </w:r>
+      <w:r>
+        <w:rPr>
+          <w:color w:val="000000"/>
+        </w:rPr>
+      </w:r>
+      <w:r>
+        <w:rPr>
+          <w:color w:val="000000"/>
+          <w:lang w:val="ru-RU"/>
+        </w:rPr>
+      </w:r>
+      <w:r>
+        <w:rPr>
+          <w:color w:val="000000"/>
+        </w:rPr>
+      </w:r>
+      <w:r>
+        <w:rPr>
+          <w:color w:val="000000"/>
+          <w:lang w:val="ru-RU"/>
+        </w:rPr>
+      </w:r>
+      <w:r>
+        <w:rPr>
+          <w:color w:val="000000"/>
+        </w:rPr>
+      </w:r>
+      <w:r>
+        <w:rPr>
+          <w:color w:val="000000"/>
+          <w:lang w:val="ru-RU"/>
+        </w:rPr>
       </w:r>
     </w:p>
     <w:p>
@@ -2797,7 +2087,7 @@
           <w:sz w:val="19"/>
           <w:lang w:val="ru-RU"/>
         </w:rPr>
-        <w:t xml:space="preserve">Рисунок 10 — Тестовый коммит в зеркальном репозитории </w:t>
+        <w:t>Рисунок 10 — Тестовый коммит в зеркальном репозитории GitLab</w:t>
       </w:r>
       <w:r>
         <w:rPr>
@@ -2805,7 +2095,6 @@
           <w:color w:val="000000"/>
           <w:sz w:val="19"/>
         </w:rPr>
-        <w:t>GitHub</w:t>
       </w:r>
     </w:p>
     <w:p>
@@ -2936,122 +2225,12 @@
       <w:r>
         <w:rPr>
           <w:b/>
-          <w:color w:val="000000"/>
-          <w:sz w:val="21"/>
-          <w:lang w:val="ru-RU"/>
         </w:rPr>
         <w:t xml:space="preserve">Зеркальный репозиторий: </w:t>
       </w:r>
-      <w:hyperlink r:id="rId19">
-        <w:proofErr w:type="spellStart"/>
-        <w:r>
-          <w:rPr>
-            <w:rFonts w:ascii="Menlo" w:hAnsi="Menlo"/>
-            <w:color w:val="1F4E79"/>
-            <w:sz w:val="20"/>
-            <w:u w:val="single"/>
-          </w:rPr>
-          <w:t>github</w:t>
-        </w:r>
-        <w:proofErr w:type="spellEnd"/>
-        <w:r>
-          <w:rPr>
-            <w:rFonts w:ascii="Menlo" w:hAnsi="Menlo"/>
-            <w:color w:val="1F4E79"/>
-            <w:sz w:val="20"/>
-            <w:u w:val="single"/>
-            <w:lang w:val="ru-RU"/>
-          </w:rPr>
-          <w:t>.</w:t>
-        </w:r>
-        <w:r>
-          <w:rPr>
-            <w:rFonts w:ascii="Menlo" w:hAnsi="Menlo"/>
-            <w:color w:val="1F4E79"/>
-            <w:sz w:val="20"/>
-            <w:u w:val="single"/>
-          </w:rPr>
-          <w:t>com</w:t>
-        </w:r>
-        <w:r>
-          <w:rPr>
-            <w:rFonts w:ascii="Menlo" w:hAnsi="Menlo"/>
-            <w:color w:val="1F4E79"/>
-            <w:sz w:val="20"/>
-            <w:u w:val="single"/>
-            <w:lang w:val="ru-RU"/>
-          </w:rPr>
-          <w:t>/</w:t>
-        </w:r>
-        <w:r>
-          <w:rPr>
-            <w:rFonts w:ascii="Menlo" w:hAnsi="Menlo"/>
-            <w:color w:val="1F4E79"/>
-            <w:sz w:val="20"/>
-            <w:u w:val="single"/>
-          </w:rPr>
-          <w:t>blur</w:t>
-        </w:r>
-        <w:r>
-          <w:rPr>
-            <w:rFonts w:ascii="Menlo" w:hAnsi="Menlo"/>
-            <w:color w:val="1F4E79"/>
-            <w:sz w:val="20"/>
-            <w:u w:val="single"/>
-            <w:lang w:val="ru-RU"/>
-          </w:rPr>
-          <w:t>3773/</w:t>
-        </w:r>
-        <w:proofErr w:type="spellStart"/>
-        <w:r>
-          <w:rPr>
-            <w:rFonts w:ascii="Menlo" w:hAnsi="Menlo"/>
-            <w:color w:val="1F4E79"/>
-            <w:sz w:val="20"/>
-            <w:u w:val="single"/>
-          </w:rPr>
-          <w:t>devops</w:t>
-        </w:r>
-        <w:proofErr w:type="spellEnd"/>
-        <w:r>
-          <w:rPr>
-            <w:rFonts w:ascii="Menlo" w:hAnsi="Menlo"/>
-            <w:color w:val="1F4E79"/>
-            <w:sz w:val="20"/>
-            <w:u w:val="single"/>
-            <w:lang w:val="ru-RU"/>
-          </w:rPr>
-          <w:t>-</w:t>
-        </w:r>
-        <w:r>
-          <w:rPr>
-            <w:rFonts w:ascii="Menlo" w:hAnsi="Menlo"/>
-            <w:color w:val="1F4E79"/>
-            <w:sz w:val="20"/>
-            <w:u w:val="single"/>
-          </w:rPr>
-          <w:t>course</w:t>
-        </w:r>
-        <w:r>
-          <w:rPr>
-            <w:rFonts w:ascii="Menlo" w:hAnsi="Menlo"/>
-            <w:color w:val="1F4E79"/>
-            <w:sz w:val="20"/>
-            <w:u w:val="single"/>
-            <w:lang w:val="ru-RU"/>
-          </w:rPr>
-          <w:t>-2026-</w:t>
-        </w:r>
-        <w:r>
-          <w:rPr>
-            <w:rFonts w:ascii="Menlo" w:hAnsi="Menlo"/>
-            <w:color w:val="1F4E79"/>
-            <w:sz w:val="20"/>
-            <w:u w:val="single"/>
-          </w:rPr>
-          <w:t>mirror</w:t>
-        </w:r>
-      </w:hyperlink>
+      <w:r>
+        <w:t>gitlab.com/blur3773/devops-course-2026-mirror</w:t>
+      </w:r>
     </w:p>
     <w:p>
       <w:pPr>
@@ -3069,13 +2248,14 @@
           <w:lang w:val="ru-RU"/>
         </w:rPr>
         <w:lastRenderedPageBreak/>
-        <w:t>7</w:t>
+        <w:t>6</w:t>
       </w:r>
       <w:r>
         <w:rPr>
           <w:b/>
           <w:color w:val="000000"/>
           <w:sz w:val="32"/>
+          <w:lang w:val="ru-RU"/>
         </w:rPr>
         <w:t>.</w:t>
       </w:r>
@@ -3104,7 +2284,16 @@
           <w:sz w:val="26"/>
           <w:lang w:val="ru-RU"/>
         </w:rPr>
-        <w:t>7.1 Перенос отдельного коммита</w:t>
+        <w:t>6</w:t>
+      </w:r>
+      <w:r>
+        <w:rPr>
+          <w:b/>
+          <w:color w:val="000000"/>
+          <w:sz w:val="26"/>
+          <w:lang w:val="ru-RU"/>
+        </w:rPr>
+        <w:t>.1 Перенос отдельного коммита</w:t>
       </w:r>
     </w:p>
     <w:p>
@@ -3307,7 +2496,16 @@
           <w:sz w:val="26"/>
           <w:lang w:val="ru-RU"/>
         </w:rPr>
-        <w:t>7.2 Восстановление удалённого коммита</w:t>
+        <w:t>6</w:t>
+      </w:r>
+      <w:r>
+        <w:rPr>
+          <w:b/>
+          <w:color w:val="000000"/>
+          <w:sz w:val="26"/>
+          <w:lang w:val="ru-RU"/>
+        </w:rPr>
+        <w:t>.2 Восстановление удалённого коммита</w:t>
       </w:r>
     </w:p>
     <w:p>
@@ -3649,7 +2847,16 @@
           <w:sz w:val="26"/>
           <w:lang w:val="ru-RU"/>
         </w:rPr>
-        <w:t>7.3 Безопасная отмена опубликованного изменения</w:t>
+        <w:t>6</w:t>
+      </w:r>
+      <w:r>
+        <w:rPr>
+          <w:b/>
+          <w:color w:val="000000"/>
+          <w:sz w:val="26"/>
+          <w:lang w:val="ru-RU"/>
+        </w:rPr>
+        <w:t>.3 Безопасная отмена опубликованного изменения</w:t>
       </w:r>
     </w:p>
     <w:p>
@@ -3822,7 +3029,16 @@
           <w:sz w:val="32"/>
           <w:lang w:val="ru-RU"/>
         </w:rPr>
-        <w:t>8 Вывод</w:t>
+        <w:t>7</w:t>
+      </w:r>
+      <w:r>
+        <w:rPr>
+          <w:b/>
+          <w:color w:val="000000"/>
+          <w:sz w:val="32"/>
+          <w:lang w:val="ru-RU"/>
+        </w:rPr>
+        <w:t xml:space="preserve"> Вывод</w:t>
       </w:r>
     </w:p>
     <w:p>

</xml_diff>